<commit_message>
Update job application workspace and playbooks
</commit_message>
<xml_diff>
--- a/AI_ROLES/Yaswanth_Muppalla_AI_Resume.docx
+++ b/AI_ROLES/Yaswanth_Muppalla_AI_Resume.docx
@@ -65,6 +65,9 @@
         <w:t>AI Platform Engineer</w:t>
       </w:r>
       <w:r>
+        <w:rPr>
+          <w:b w:val="0"/>
+        </w:rPr>
         <w:t xml:space="preserve"> | </w:t>
       </w:r>
       <w:r>
@@ -74,16 +77,16 @@
         <w:t>Senior Software Engineer</w:t>
       </w:r>
       <w:r>
-        <w:t xml:space="preserve"> | Backend Systems | </w:t>
+        <w:rPr>
+          <w:b w:val="0"/>
+        </w:rPr>
+        <w:t xml:space="preserve"> | Backend &amp; Agent Systems | </w:t>
       </w:r>
       <w:r>
         <w:rPr>
           <w:b/>
         </w:rPr>
-        <w:t>AWS</w:t>
-      </w:r>
-      <w:r>
-        <w:t xml:space="preserve"> | Data Engineering</w:t>
+        <w:t>AWS/GCP</w:t>
       </w:r>
     </w:p>
     <w:p>
@@ -139,89 +142,114 @@
       <w:r>
         <w:rPr>
           <w:b/>
+          <w:i w:val="0"/>
         </w:rPr>
         <w:t>Impact:</w:t>
       </w:r>
       <w:r>
-        <w:t xml:space="preserve"> Built </w:t>
-      </w:r>
-      <w:r>
-        <w:t xml:space="preserve">Java, </w:t>
+        <w:rPr>
+          <w:b w:val="0"/>
+          <w:i w:val="0"/>
+        </w:rPr>
+        <w:t xml:space="preserve"> Delivered </w:t>
       </w:r>
       <w:r>
         <w:rPr>
           <w:b/>
-          <w:bCs/>
-        </w:rPr>
-        <w:t xml:space="preserve">Kafka, </w:t>
+          <w:i w:val="0"/>
+        </w:rPr>
+        <w:t>AWS-based Java/Python APIs</w:t>
+      </w:r>
+      <w:r>
+        <w:rPr>
+          <w:b w:val="0"/>
+          <w:i w:val="0"/>
+        </w:rPr>
+        <w:t xml:space="preserve"> and </w:t>
       </w:r>
       <w:r>
         <w:rPr>
           <w:b/>
-          <w:bCs/>
-        </w:rPr>
-        <w:t>Flink, Airflow</w:t>
-      </w:r>
-      <w:r>
-        <w:t>, and</w:t>
-      </w:r>
-      <w:r>
-        <w:t xml:space="preserve"> </w:t>
+          <w:i w:val="0"/>
+        </w:rPr>
+        <w:t>IRIS AI platform services</w:t>
+      </w:r>
+      <w:r>
+        <w:rPr>
+          <w:b w:val="0"/>
+          <w:i w:val="0"/>
+        </w:rPr>
+        <w:t xml:space="preserve"> plus </w:t>
       </w:r>
       <w:r>
         <w:rPr>
           <w:b/>
-          <w:bCs/>
-        </w:rPr>
-        <w:t>API</w:t>
-      </w:r>
-      <w:r>
-        <w:t xml:space="preserve"> services, IRIS</w:t>
+          <w:i w:val="0"/>
+        </w:rPr>
+        <w:t>Kafka/Flink/Airflow pipelines on GCP</w:t>
+      </w:r>
+      <w:r>
+        <w:rPr>
+          <w:b w:val="0"/>
+          <w:i w:val="0"/>
+        </w:rPr>
+        <w:t xml:space="preserve">, improving reporting efficiency by </w:t>
       </w:r>
       <w:r>
         <w:rPr>
           <w:b/>
-        </w:rPr>
-        <w:t>-backed RAG systems</w:t>
-      </w:r>
-      <w:r>
-        <w:t xml:space="preserve"> for credit oversight workflows, improving reporting efficiency by </w:t>
+          <w:i w:val="0"/>
+        </w:rPr>
+        <w:t>35%</w:t>
+      </w:r>
+      <w:r>
+        <w:rPr>
+          <w:b w:val="0"/>
+          <w:i w:val="0"/>
+        </w:rPr>
+        <w:t xml:space="preserve">, achieving </w:t>
       </w:r>
       <w:r>
         <w:rPr>
           <w:b/>
-        </w:rPr>
-        <w:t>35%</w:t>
-      </w:r>
-      <w:r>
-        <w:t xml:space="preserve">, achieving </w:t>
+          <w:i w:val="0"/>
+        </w:rPr>
+        <w:t>99% data accuracy</w:t>
+      </w:r>
+      <w:r>
+        <w:rPr>
+          <w:b w:val="0"/>
+          <w:i w:val="0"/>
+        </w:rPr>
+        <w:t xml:space="preserve">, reducing rerun/debug cycles by </w:t>
       </w:r>
       <w:r>
         <w:rPr>
           <w:b/>
-        </w:rPr>
-        <w:t>99% data accuracy</w:t>
-      </w:r>
-      <w:r>
-        <w:t xml:space="preserve">, reducing rerun/debug cycles by </w:t>
+          <w:i w:val="0"/>
+        </w:rPr>
+        <w:t>3x</w:t>
+      </w:r>
+      <w:r>
+        <w:rPr>
+          <w:b w:val="0"/>
+          <w:i w:val="0"/>
+        </w:rPr>
+        <w:t xml:space="preserve">, and accelerating </w:t>
       </w:r>
       <w:r>
         <w:rPr>
           <w:b/>
-        </w:rPr>
-        <w:t>3x</w:t>
-      </w:r>
-      <w:r>
-        <w:t xml:space="preserve">, and accelerating </w:t>
-      </w:r>
-      <w:r>
-        <w:rPr>
-          <w:b/>
-        </w:rPr>
-        <w:t>AI copilot support</w:t>
-      </w:r>
-      <w:r>
-        <w:t>.</w:t>
+          <w:i w:val="0"/>
+        </w:rPr>
+        <w:t>applied AI delivery</w:t>
+      </w:r>
+      <w:r>
+        <w:rPr>
+          <w:b w:val="0"/>
+          <w:i w:val="0"/>
+        </w:rPr>
+        <w:t xml:space="preserve"> for credit-oversight copilots.</w:t>
       </w:r>
     </w:p>
     <w:p>
@@ -234,6 +262,9 @@
         </w:numPr>
       </w:pPr>
       <w:r>
+        <w:rPr>
+          <w:b w:val="0"/>
+        </w:rPr>
         <w:t xml:space="preserve">Partnered with </w:t>
       </w:r>
       <w:r>
@@ -243,15 +274,21 @@
         <w:t>BCA/CCA data pipeline teams</w:t>
       </w:r>
       <w:r>
+        <w:rPr>
+          <w:b w:val="0"/>
+        </w:rPr>
         <w:t xml:space="preserve"> and built JSON-configurable </w:t>
       </w:r>
       <w:r>
         <w:rPr>
           <w:b/>
         </w:rPr>
-        <w:t>Apache Flink pipelines</w:t>
-      </w:r>
-      <w:r>
+        <w:t>Apache Flink pipelines on GCP</w:t>
+      </w:r>
+      <w:r>
+        <w:rPr>
+          <w:b w:val="0"/>
+        </w:rPr>
         <w:t xml:space="preserve"> for ingestion, transformation, joins, validation, and downstream publishing, translating workflow knowledge into </w:t>
       </w:r>
       <w:r>
@@ -261,6 +298,9 @@
         <w:t>AI-ready pipeline patterns</w:t>
       </w:r>
       <w:r>
+        <w:rPr>
+          <w:b w:val="0"/>
+        </w:rPr>
         <w:t xml:space="preserve"> for credit oversight use cases.</w:t>
       </w:r>
     </w:p>
@@ -274,57 +314,52 @@
         </w:numPr>
       </w:pPr>
       <w:r>
-        <w:t xml:space="preserve">Automated </w:t>
+        <w:rPr>
+          <w:b w:val="0"/>
+          <w:i w:val="0"/>
+        </w:rPr>
+        <w:t xml:space="preserve">Built </w:t>
       </w:r>
       <w:r>
         <w:rPr>
           <w:b/>
-        </w:rPr>
-        <w:t>Airflow orchestration</w:t>
+          <w:i w:val="0"/>
+        </w:rPr>
+        <w:t>Airflow workflow automation and API-facing publishing</w:t>
+      </w:r>
+      <w:r>
+        <w:rPr>
+          <w:b w:val="0"/>
+          <w:i w:val="0"/>
+        </w:rPr>
+        <w:t xml:space="preserve"> with dependency controls, rerun handling, </w:t>
       </w:r>
       <w:r>
         <w:rPr>
           <w:b/>
-        </w:rPr>
-        <w:t xml:space="preserve"> and </w:t>
+          <w:i w:val="0"/>
+        </w:rPr>
+        <w:t>SLA monitoring</w:t>
+      </w:r>
+      <w:r>
+        <w:rPr>
+          <w:b w:val="0"/>
+          <w:i w:val="0"/>
+        </w:rPr>
+        <w:t xml:space="preserve">, data-quality checks, and failure alerting, creating reliable signals for downstream </w:t>
       </w:r>
       <w:r>
         <w:rPr>
           <w:b/>
-        </w:rPr>
-        <w:t>API</w:t>
-      </w:r>
-      <w:r>
-        <w:rPr>
-          <w:bCs/>
-        </w:rPr>
-        <w:t xml:space="preserve"> facing downstream</w:t>
-      </w:r>
-      <w:r>
-        <w:t xml:space="preserve"> </w:t>
-      </w:r>
-      <w:r>
-        <w:t xml:space="preserve">publishing </w:t>
-      </w:r>
-      <w:r>
-        <w:t xml:space="preserve">for credit data processing with dependency management, rerun handling, </w:t>
-      </w:r>
-      <w:r>
-        <w:rPr>
-          <w:b/>
-        </w:rPr>
-        <w:t>SLA monitoring</w:t>
-      </w:r>
-      <w:r>
-        <w:t xml:space="preserve">, data-quality, and failure alerting, creating reliable signals for downstream </w:t>
-      </w:r>
-      <w:r>
-        <w:rPr>
-          <w:b/>
-        </w:rPr>
-        <w:t>AI copilot and RAG workflows</w:t>
-      </w:r>
-      <w:r>
+          <w:i w:val="0"/>
+        </w:rPr>
+        <w:t>AI platform and copilot services</w:t>
+      </w:r>
+      <w:r>
+        <w:rPr>
+          <w:b w:val="0"/>
+          <w:i w:val="0"/>
+        </w:rPr>
         <w:t>.</w:t>
       </w:r>
     </w:p>
@@ -338,33 +373,52 @@
         </w:numPr>
       </w:pPr>
       <w:r>
+        <w:rPr>
+          <w:b w:val="0"/>
+          <w:i w:val="0"/>
+        </w:rPr>
         <w:t xml:space="preserve">Designed an </w:t>
       </w:r>
       <w:r>
         <w:rPr>
           <w:b/>
-        </w:rPr>
-        <w:t>IRIS-backed ingestion pipeline</w:t>
-      </w:r>
-      <w:r>
+          <w:i w:val="0"/>
+        </w:rPr>
+        <w:t>IRIS-backed RAG ingestion platform</w:t>
+      </w:r>
+      <w:r>
+        <w:rPr>
+          <w:b w:val="0"/>
+          <w:i w:val="0"/>
+        </w:rPr>
         <w:t xml:space="preserve"> with document extraction, deduplication, upsert handling, segmentation, </w:t>
       </w:r>
       <w:r>
         <w:rPr>
           <w:b/>
+          <w:i w:val="0"/>
         </w:rPr>
         <w:t>chunking</w:t>
       </w:r>
       <w:r>
+        <w:rPr>
+          <w:b w:val="0"/>
+          <w:i w:val="0"/>
+        </w:rPr>
         <w:t xml:space="preserve">, metadata enrichment, and batch publishing for </w:t>
       </w:r>
       <w:r>
         <w:rPr>
           <w:b/>
+          <w:i w:val="0"/>
         </w:rPr>
         <w:t>semantic retrieval</w:t>
       </w:r>
       <w:r>
+        <w:rPr>
+          <w:b w:val="0"/>
+          <w:i w:val="0"/>
+        </w:rPr>
         <w:t>.</w:t>
       </w:r>
     </w:p>
@@ -378,16 +432,22 @@
         </w:numPr>
       </w:pPr>
       <w:r>
+        <w:rPr>
+          <w:b w:val="0"/>
+        </w:rPr>
         <w:t xml:space="preserve">Developed a </w:t>
       </w:r>
       <w:r>
         <w:rPr>
           <w:b/>
         </w:rPr>
-        <w:t>RAG agent harness</w:t>
-      </w:r>
-      <w:r>
-        <w:t xml:space="preserve"> that combined IRIS semantic search, scoped retrieval, prompt assembly, </w:t>
+        <w:t>reusable agent platform harness</w:t>
+      </w:r>
+      <w:r>
+        <w:rPr>
+          <w:b w:val="0"/>
+        </w:rPr>
+        <w:t xml:space="preserve"> combining IRIS semantic search, scoped retrieval, prompt assembly, </w:t>
       </w:r>
       <w:r>
         <w:rPr>
@@ -396,6 +456,9 @@
         <w:t>source-ledger tracking</w:t>
       </w:r>
       <w:r>
+        <w:rPr>
+          <w:b w:val="0"/>
+        </w:rPr>
         <w:t xml:space="preserve">, and </w:t>
       </w:r>
       <w:r>
@@ -405,6 +468,9 @@
         <w:t>grounded response generation</w:t>
       </w:r>
       <w:r>
+        <w:rPr>
+          <w:b w:val="0"/>
+        </w:rPr>
         <w:t xml:space="preserve"> for credit oversight users.</w:t>
       </w:r>
     </w:p>
@@ -417,33 +483,57 @@
         </w:numPr>
       </w:pPr>
       <w:r>
-        <w:t xml:space="preserve">Built a </w:t>
+        <w:rPr>
+          <w:b w:val="0"/>
+        </w:rPr>
+        <w:t xml:space="preserve">Partnered with </w:t>
       </w:r>
       <w:r>
         <w:rPr>
           <w:b/>
         </w:rPr>
-        <w:t>context harness</w:t>
-      </w:r>
-      <w:r>
-        <w:t xml:space="preserve"> for chatbot-style interactions, managing </w:t>
+        <w:t>cross-functional product, data, and AI teams</w:t>
+      </w:r>
+      <w:r>
+        <w:rPr>
+          <w:b w:val="0"/>
+        </w:rPr>
+        <w:t xml:space="preserve"> to engineer an </w:t>
       </w:r>
       <w:r>
         <w:rPr>
           <w:b/>
         </w:rPr>
-        <w:t>session context</w:t>
-      </w:r>
-      <w:r>
-        <w:t xml:space="preserve">, selected documents, retrieved chunks, policy context, user query intent, and </w:t>
+        <w:t>agent context harness</w:t>
+      </w:r>
+      <w:r>
+        <w:rPr>
+          <w:b w:val="0"/>
+        </w:rPr>
+        <w:t xml:space="preserve"> managing </w:t>
       </w:r>
       <w:r>
         <w:rPr>
           <w:b/>
         </w:rPr>
+        <w:t>session state</w:t>
+      </w:r>
+      <w:r>
+        <w:rPr>
+          <w:b w:val="0"/>
+        </w:rPr>
+        <w:t xml:space="preserve">, selected documents, retrieved evidence, policy context, user intent, and </w:t>
+      </w:r>
+      <w:r>
+        <w:rPr>
+          <w:b/>
+        </w:rPr>
         <w:t>controlled LLM input assembly</w:t>
       </w:r>
       <w:r>
+        <w:rPr>
+          <w:b w:val="0"/>
+        </w:rPr>
         <w:t>.</w:t>
       </w:r>
     </w:p>
@@ -456,33 +546,66 @@
         </w:numPr>
       </w:pPr>
       <w:r>
-        <w:t xml:space="preserve">Added </w:t>
+        <w:rPr>
+          <w:b w:val="0"/>
+          <w:i w:val="0"/>
+        </w:rPr>
+        <w:t xml:space="preserve">Strengthened </w:t>
       </w:r>
       <w:r>
         <w:rPr>
           <w:b/>
-        </w:rPr>
-        <w:t>observability and control layers</w:t>
-      </w:r>
-      <w:r>
-        <w:t xml:space="preserve"> across the AI workflow, including retrieval logs, execution traces, citation mapping, </w:t>
+          <w:i w:val="0"/>
+        </w:rPr>
+        <w:t>operational excellence, observability, and governance</w:t>
+      </w:r>
+      <w:r>
+        <w:rPr>
+          <w:b w:val="0"/>
+          <w:i w:val="0"/>
+        </w:rPr>
+        <w:t xml:space="preserve"> across the </w:t>
       </w:r>
       <w:r>
         <w:rPr>
           <w:b/>
+          <w:i w:val="0"/>
+        </w:rPr>
+        <w:t>agent runtime</w:t>
+      </w:r>
+      <w:r>
+        <w:rPr>
+          <w:b w:val="0"/>
+          <w:i w:val="0"/>
+        </w:rPr>
+        <w:t xml:space="preserve"> through retrieval logs, execution traces, citation mapping, </w:t>
+      </w:r>
+      <w:r>
+        <w:rPr>
+          <w:b/>
+          <w:i w:val="0"/>
         </w:rPr>
         <w:t>guardrails</w:t>
       </w:r>
       <w:r>
+        <w:rPr>
+          <w:b w:val="0"/>
+          <w:i w:val="0"/>
+        </w:rPr>
         <w:t xml:space="preserve">, cache behavior, and </w:t>
       </w:r>
       <w:r>
         <w:rPr>
           <w:b/>
+          <w:i w:val="0"/>
         </w:rPr>
         <w:t>audit-friendly response tracking</w:t>
       </w:r>
       <w:r>
+        <w:rPr>
+          <w:b w:val="0"/>
+          <w:i w:val="0"/>
+        </w:rPr>
         <w:t>.</w:t>
       </w:r>
     </w:p>
@@ -892,7 +1015,10 @@
         </w:pBdr>
       </w:pPr>
       <w:r>
-        <w:t>FOUNDER-LED TECHNICAL PROJECTS</w:t>
+        <w:rPr>
+          <w:color w:val="000000"/>
+        </w:rPr>
+        <w:t>FOUNDER-LED 0-TO-1 TECHNICAL PROJECT</w:t>
       </w:r>
     </w:p>
     <w:p>
@@ -906,24 +1032,21 @@
       <w:r>
         <w:rPr>
           <w:b/>
-        </w:rPr>
-        <w:t>OmInsights</w:t>
-      </w:r>
-      <w:r>
-        <w:t xml:space="preserve"> - </w:t>
+          <w:i w:val="0"/>
+        </w:rPr>
+        <w:t>OmInsights - Founder-Led Applied AI Platform Build</w:t>
+      </w:r>
+      <w:r>
+        <w:rPr>
+          <w:b w:val="0"/>
+          <w:i w:val="0"/>
+        </w:rPr>
+        <w:tab/>
       </w:r>
       <w:r>
         <w:rPr>
           <w:b/>
-        </w:rPr>
-        <w:t>Founder-Led AI Platform Build</w:t>
-      </w:r>
-      <w:r>
-        <w:tab/>
-      </w:r>
-      <w:r>
-        <w:rPr>
-          <w:b/>
+          <w:i w:val="0"/>
         </w:rPr>
         <w:t>Jan 2024 - Present</w:t>
       </w:r>
@@ -940,6 +1063,9 @@
         <w:t>Impact:</w:t>
       </w:r>
       <w:r>
+        <w:rPr>
+          <w:b w:val="0"/>
+        </w:rPr>
         <w:t xml:space="preserve"> Built a </w:t>
       </w:r>
       <w:r>
@@ -949,31 +1075,34 @@
         <w:t>6-component AI platform</w:t>
       </w:r>
       <w:r>
+        <w:rPr>
+          <w:b w:val="0"/>
+        </w:rPr>
         <w:t xml:space="preserve"> with </w:t>
       </w:r>
       <w:r>
         <w:rPr>
           <w:b/>
         </w:rPr>
-        <w:t xml:space="preserve">tenant-scoped </w:t>
+        <w:t>tenant-scoped APIs</w:t>
+      </w:r>
+      <w:r>
+        <w:rPr>
+          <w:b w:val="0"/>
+        </w:rPr>
+        <w:t xml:space="preserve">, agent/context orchestration, MCP tool execution, async file processing, and </w:t>
       </w:r>
       <w:r>
         <w:rPr>
           <w:b/>
         </w:rPr>
-        <w:t>API’s</w:t>
-      </w:r>
-      <w:r>
-        <w:t xml:space="preserve">, Context Engine orchestration, MCP tool execution, async file processing, and </w:t>
-      </w:r>
-      <w:r>
-        <w:rPr>
-          <w:b/>
-        </w:rPr>
-        <w:t>source-backed answers</w:t>
-      </w:r>
-      <w:r>
-        <w:t xml:space="preserve"> over owned documents.</w:t>
+        <w:t>source-backed intelligence</w:t>
+      </w:r>
+      <w:r>
+        <w:rPr>
+          <w:b w:val="0"/>
+        </w:rPr>
+        <w:t xml:space="preserve"> with tenant isolation, citations, and traceability.</w:t>
       </w:r>
     </w:p>
     <w:p>
@@ -986,43 +1115,22 @@
         </w:numPr>
       </w:pPr>
       <w:r>
+        <w:rPr>
+          <w:b w:val="0"/>
+        </w:rPr>
         <w:t xml:space="preserve">Architected </w:t>
       </w:r>
       <w:r>
         <w:rPr>
           <w:b/>
         </w:rPr>
-        <w:t>Angular UI</w:t>
-      </w:r>
-      <w:r>
-        <w:t xml:space="preserve">, </w:t>
-      </w:r>
-      <w:r>
-        <w:rPr>
-          <w:b/>
-        </w:rPr>
-        <w:t>FastAPI Business Service</w:t>
-      </w:r>
-      <w:r>
-        <w:t xml:space="preserve">, </w:t>
-      </w:r>
-      <w:r>
-        <w:rPr>
-          <w:b/>
-        </w:rPr>
-        <w:t>Context Engine</w:t>
-      </w:r>
-      <w:r>
-        <w:t xml:space="preserve">, </w:t>
-      </w:r>
-      <w:r>
-        <w:rPr>
-          <w:b/>
-        </w:rPr>
-        <w:t>MCP Server</w:t>
-      </w:r>
-      <w:r>
-        <w:t>, File Processing worker, and AWS-backed deployment paths with CI/CD and tenant-aware AWS operations.</w:t>
+        <w:t>Angular UI, FastAPI Business Service, Context Engine, MCP Server</w:t>
+      </w:r>
+      <w:r>
+        <w:rPr>
+          <w:b w:val="0"/>
+        </w:rPr>
+        <w:t>, File Processing worker, and AWS deployment paths with CI/CD, environment promotion, secrets/config handling, and tenant-aware operations.</w:t>
       </w:r>
     </w:p>
     <w:p>
@@ -1035,34 +1143,34 @@
         </w:numPr>
       </w:pPr>
       <w:r>
-        <w:t xml:space="preserve">Built </w:t>
+        <w:rPr>
+          <w:b w:val="0"/>
+        </w:rPr>
+        <w:t xml:space="preserve">Built an </w:t>
       </w:r>
       <w:r>
         <w:rPr>
           <w:b/>
         </w:rPr>
-        <w:t>document intelligence pipelines</w:t>
-      </w:r>
-      <w:r>
-        <w:t xml:space="preserve"> for upload, parse, normalize, chunk, embed, persist, retrieve, and cite flows for </w:t>
+        <w:t>AI evaluation layer</w:t>
+      </w:r>
+      <w:r>
+        <w:rPr>
+          <w:b w:val="0"/>
+        </w:rPr>
+        <w:t xml:space="preserve"> with groundedness, relevance, citation, and policy checks, </w:t>
       </w:r>
       <w:r>
         <w:rPr>
           <w:b/>
         </w:rPr>
-        <w:t>grounded RAG responses</w:t>
-      </w:r>
-      <w:r>
-        <w:t xml:space="preserve"> with </w:t>
-      </w:r>
-      <w:r>
-        <w:rPr>
-          <w:b/>
-        </w:rPr>
-        <w:t>source ledgers</w:t>
-      </w:r>
-      <w:r>
-        <w:t xml:space="preserve"> and retrieval quality controls.</w:t>
+        <w:t>LLM-as-a-judge scoring</w:t>
+      </w:r>
+      <w:r>
+        <w:rPr>
+          <w:b w:val="0"/>
+        </w:rPr>
+        <w:t>, and regression tracking.</w:t>
       </w:r>
     </w:p>
     <w:p>
@@ -1075,6 +1183,9 @@
         </w:numPr>
       </w:pPr>
       <w:r>
+        <w:rPr>
+          <w:b w:val="0"/>
+        </w:rPr>
         <w:t xml:space="preserve">Designed </w:t>
       </w:r>
       <w:r>
@@ -1084,6 +1195,9 @@
         <w:t>Context Engine flows</w:t>
       </w:r>
       <w:r>
+        <w:rPr>
+          <w:b w:val="0"/>
+        </w:rPr>
         <w:t xml:space="preserve"> for </w:t>
       </w:r>
       <w:r>
@@ -1093,6 +1207,9 @@
         <w:t>chat/session memory</w:t>
       </w:r>
       <w:r>
+        <w:rPr>
+          <w:b w:val="0"/>
+        </w:rPr>
         <w:t xml:space="preserve">, selected context, KB injection, prompt assembly, and </w:t>
       </w:r>
       <w:r>
@@ -1102,7 +1219,10 @@
         <w:t>LLM/context harness design</w:t>
       </w:r>
       <w:r>
-        <w:t xml:space="preserve"> for multi-turn RAG orchestration and scoped answer grounding.</w:t>
+        <w:rPr>
+          <w:b w:val="0"/>
+        </w:rPr>
+        <w:t xml:space="preserve"> for multi-turn agent orchestration, policy-aware grounding, and session continuity.</w:t>
       </w:r>
     </w:p>
     <w:p>
@@ -1115,6 +1235,9 @@
         </w:numPr>
       </w:pPr>
       <w:r>
+        <w:rPr>
+          <w:b w:val="0"/>
+        </w:rPr>
         <w:t xml:space="preserve">Implemented </w:t>
       </w:r>
       <w:r>
@@ -1124,25 +1247,22 @@
         <w:t>MCP/API runtime patterns</w:t>
       </w:r>
       <w:r>
-        <w:t xml:space="preserve"> with </w:t>
+        <w:rPr>
+          <w:b w:val="0"/>
+        </w:rPr>
+        <w:t xml:space="preserve"> and a shared </w:t>
       </w:r>
       <w:r>
         <w:rPr>
           <w:b/>
         </w:rPr>
-        <w:t>tool catalog APIs</w:t>
-      </w:r>
-      <w:r>
-        <w:t xml:space="preserve">, native/template tools, </w:t>
-      </w:r>
-      <w:r>
-        <w:rPr>
-          <w:b/>
-        </w:rPr>
-        <w:t>scoped document search</w:t>
-      </w:r>
-      <w:r>
-        <w:t>, execution logging, cache behavior, and access-aware tool selection.</w:t>
+        <w:t>LLM gateway across platform layers</w:t>
+      </w:r>
+      <w:r>
+        <w:rPr>
+          <w:b w:val="0"/>
+        </w:rPr>
+        <w:t>, centralizing model/provider routing, request policies, retries/fallbacks, tool access, usage logging, and execution traces.</w:t>
       </w:r>
     </w:p>
     <w:p>
@@ -1155,34 +1275,22 @@
         </w:numPr>
       </w:pPr>
       <w:r>
-        <w:t xml:space="preserve">Combined </w:t>
+        <w:rPr>
+          <w:b w:val="0"/>
+        </w:rPr>
+        <w:t xml:space="preserve">Created </w:t>
       </w:r>
       <w:r>
         <w:rPr>
           <w:b/>
         </w:rPr>
-        <w:t>source-ledger</w:t>
-      </w:r>
-      <w:r>
-        <w:t xml:space="preserve">, </w:t>
-      </w:r>
-      <w:r>
-        <w:rPr>
-          <w:b/>
-        </w:rPr>
-        <w:t>citation</w:t>
-      </w:r>
-      <w:r>
-        <w:t xml:space="preserve">, guardrail, caching, and </w:t>
-      </w:r>
-      <w:r>
-        <w:rPr>
-          <w:b/>
-        </w:rPr>
-        <w:t>semantic caching</w:t>
-      </w:r>
-      <w:r>
-        <w:t xml:space="preserve"> patterns to keep AI outputs grounded and traceable.</w:t>
+        <w:t>single-founder execution playbooks</w:t>
+      </w:r>
+      <w:r>
+        <w:rPr>
+          <w:b w:val="0"/>
+        </w:rPr>
+        <w:t xml:space="preserve"> across each platform layer for architecture decisions, implementation, deployment, testing, observability, and recovery, standardizing repeatable delivery and accelerating execution.</w:t>
       </w:r>
     </w:p>
     <w:p>
@@ -1205,9 +1313,12 @@
         <w:rPr>
           <w:b/>
         </w:rPr>
-        <w:t>AI/LLM Systems:</w:t>
-      </w:r>
-      <w:r>
+        <w:t>AI Platform &amp; Agent Systems:</w:t>
+      </w:r>
+      <w:r>
+        <w:rPr>
+          <w:b w:val="0"/>
+        </w:rPr>
         <w:t xml:space="preserve"> </w:t>
       </w:r>
       <w:r>
@@ -1217,6 +1328,9 @@
         <w:t>RAG</w:t>
       </w:r>
       <w:r>
+        <w:rPr>
+          <w:b w:val="0"/>
+        </w:rPr>
         <w:t xml:space="preserve">, embeddings, </w:t>
       </w:r>
       <w:r>
@@ -1226,6 +1340,9 @@
         <w:t>vector search</w:t>
       </w:r>
       <w:r>
+        <w:rPr>
+          <w:b w:val="0"/>
+        </w:rPr>
         <w:t xml:space="preserve">, LangChain/LangGraph, LlamaIndex/LlamaParse, </w:t>
       </w:r>
       <w:r>
@@ -1235,6 +1352,9 @@
         <w:t>MCP/FastMCP</w:t>
       </w:r>
       <w:r>
+        <w:rPr>
+          <w:b w:val="0"/>
+        </w:rPr>
         <w:t xml:space="preserve">, OpenAI APIs, </w:t>
       </w:r>
       <w:r>
@@ -1244,7 +1364,46 @@
         <w:t>Amazon Bedrock</w:t>
       </w:r>
       <w:r>
-        <w:t>, prompt orchestration, agent workflows/evaluation, LLMOps, semantic caching, context orchestration</w:t>
+        <w:rPr>
+          <w:b w:val="0"/>
+        </w:rPr>
+        <w:t xml:space="preserve">, </w:t>
+      </w:r>
+      <w:r>
+        <w:rPr>
+          <w:b/>
+        </w:rPr>
+        <w:t>LLM gateways</w:t>
+      </w:r>
+      <w:r>
+        <w:rPr>
+          <w:b w:val="0"/>
+        </w:rPr>
+        <w:t xml:space="preserve">, </w:t>
+      </w:r>
+      <w:r>
+        <w:rPr>
+          <w:b/>
+        </w:rPr>
+        <w:t>LLM-as-a-judge evaluation</w:t>
+      </w:r>
+      <w:r>
+        <w:rPr>
+          <w:b w:val="0"/>
+        </w:rPr>
+        <w:t xml:space="preserve">, </w:t>
+      </w:r>
+      <w:r>
+        <w:rPr>
+          <w:b/>
+        </w:rPr>
+        <w:t>guardrails</w:t>
+      </w:r>
+      <w:r>
+        <w:rPr>
+          <w:b w:val="0"/>
+        </w:rPr>
+        <w:t>, LLMOps, semantic caching, context orchestration</w:t>
       </w:r>
     </w:p>
     <w:p>
@@ -1258,51 +1417,69 @@
         <w:t>Backend:</w:t>
       </w:r>
       <w:r>
+        <w:rPr>
+          <w:b w:val="0"/>
+        </w:rPr>
         <w:t xml:space="preserve"> </w:t>
       </w:r>
       <w:r>
         <w:rPr>
           <w:b/>
         </w:rPr>
+        <w:t>Java 17</w:t>
+      </w:r>
+      <w:r>
+        <w:rPr>
+          <w:b w:val="0"/>
+        </w:rPr>
+        <w:t xml:space="preserve">, </w:t>
+      </w:r>
+      <w:r>
+        <w:rPr>
+          <w:b/>
+        </w:rPr>
         <w:t>Python</w:t>
       </w:r>
       <w:r>
+        <w:rPr>
+          <w:b w:val="0"/>
+        </w:rPr>
+        <w:t xml:space="preserve">, Scala, </w:t>
+      </w:r>
+      <w:r>
+        <w:rPr>
+          <w:b/>
+        </w:rPr>
+        <w:t>FastAPI</w:t>
+      </w:r>
+      <w:r>
+        <w:rPr>
+          <w:b w:val="0"/>
+        </w:rPr>
+        <w:t xml:space="preserve">, Pydantic, </w:t>
+      </w:r>
+      <w:r>
+        <w:rPr>
+          <w:b/>
+        </w:rPr>
+        <w:t>Spring Boot</w:t>
+      </w:r>
+      <w:r>
+        <w:rPr>
+          <w:b w:val="0"/>
+        </w:rPr>
         <w:t xml:space="preserve">, </w:t>
       </w:r>
       <w:r>
         <w:rPr>
           <w:b/>
         </w:rPr>
-        <w:t>FastAPI</w:t>
-      </w:r>
-      <w:r>
-        <w:t xml:space="preserve">, Pydantic, </w:t>
-      </w:r>
-      <w:r>
-        <w:rPr>
-          <w:b/>
-        </w:rPr>
-        <w:t>Java 17</w:t>
-      </w:r>
-      <w:r>
-        <w:t xml:space="preserve">, </w:t>
-      </w:r>
-      <w:r>
-        <w:rPr>
-          <w:b/>
-        </w:rPr>
-        <w:t>Spring Boot</w:t>
-      </w:r>
-      <w:r>
-        <w:t xml:space="preserve">, </w:t>
-      </w:r>
-      <w:r>
-        <w:rPr>
-          <w:b/>
-        </w:rPr>
         <w:t>REST APIs</w:t>
       </w:r>
       <w:r>
+        <w:rPr>
+          <w:b w:val="0"/>
+        </w:rPr>
         <w:t>, JWT, microservices, Java concurrency, TypeScript/Angular</w:t>
       </w:r>
     </w:p>
@@ -1317,24 +1494,45 @@
         <w:t>Cloud &amp; Data:</w:t>
       </w:r>
       <w:r>
+        <w:rPr>
+          <w:b w:val="0"/>
+        </w:rPr>
         <w:t xml:space="preserve"> </w:t>
       </w:r>
       <w:r>
         <w:rPr>
           <w:b/>
         </w:rPr>
-        <w:t>AWS Lambda</w:t>
-      </w:r>
-      <w:r>
-        <w:t xml:space="preserve">, ECS/S3/SQS, </w:t>
+        <w:t>AWS</w:t>
+      </w:r>
+      <w:r>
+        <w:rPr>
+          <w:b w:val="0"/>
+        </w:rPr>
+        <w:t xml:space="preserve">, </w:t>
       </w:r>
       <w:r>
         <w:rPr>
           <w:b/>
         </w:rPr>
+        <w:t>GCP</w:t>
+      </w:r>
+      <w:r>
+        <w:rPr>
+          <w:b w:val="0"/>
+        </w:rPr>
+        <w:t xml:space="preserve">, Lambda, ECS/S3/SQS, </w:t>
+      </w:r>
+      <w:r>
+        <w:rPr>
+          <w:b/>
+        </w:rPr>
         <w:t>Step Functions</w:t>
       </w:r>
       <w:r>
+        <w:rPr>
+          <w:b w:val="0"/>
+        </w:rPr>
         <w:t xml:space="preserve">, API Gateway/EventBridge, Docker, CI/CD, MongoDB, Redis, MemSQL, Kafka, </w:t>
       </w:r>
       <w:r>
@@ -1344,6 +1542,9 @@
         <w:t>Flink</w:t>
       </w:r>
       <w:r>
+        <w:rPr>
+          <w:b w:val="0"/>
+        </w:rPr>
         <w:t>/</w:t>
       </w:r>
       <w:r>

</xml_diff>

<commit_message>
Refresh application workflow and materials
</commit_message>
<xml_diff>
--- a/AI_ROLES/Yaswanth_Muppalla_AI_Resume.docx
+++ b/AI_ROLES/Yaswanth_Muppalla_AI_Resume.docx
@@ -112,24 +112,28 @@
       <w:r>
         <w:rPr>
           <w:b/>
+          <w:i w:val="0"/>
         </w:rPr>
         <w:t>American Express</w:t>
       </w:r>
       <w:r>
-        <w:t xml:space="preserve"> | </w:t>
+        <w:rPr>
+          <w:b w:val="0"/>
+          <w:i w:val="0"/>
+        </w:rPr>
+        <w:t xml:space="preserve"> | Senior Software Engineer | AI Engineer</w:t>
+      </w:r>
+      <w:r>
+        <w:rPr>
+          <w:b w:val="0"/>
+          <w:i w:val="0"/>
+        </w:rPr>
+        <w:tab/>
       </w:r>
       <w:r>
         <w:rPr>
           <w:b/>
-        </w:rPr>
-        <w:t>Senior Software AI Engineer</w:t>
-      </w:r>
-      <w:r>
-        <w:tab/>
-      </w:r>
-      <w:r>
-        <w:rPr>
-          <w:b/>
+          <w:i w:val="0"/>
         </w:rPr>
         <w:t>Apr 2023 - Present</w:t>
       </w:r>
@@ -186,7 +190,7 @@
           <w:b/>
           <w:i w:val="0"/>
         </w:rPr>
-        <w:t>Kafka/Flink/Airflow pipelines on GCP</w:t>
+        <w:t>Kafka/Flink/Airflow pipelines for digital banking</w:t>
       </w:r>
       <w:r>
         <w:rPr>
@@ -235,21 +239,21 @@
           <w:b w:val="0"/>
           <w:i w:val="0"/>
         </w:rPr>
-        <w:t xml:space="preserve">, and accelerating </w:t>
+        <w:t xml:space="preserve">, and accelerating applied AI delivery for </w:t>
       </w:r>
       <w:r>
         <w:rPr>
           <w:b/>
           <w:i w:val="0"/>
         </w:rPr>
-        <w:t>applied AI delivery</w:t>
+        <w:t>credit-oversight copilots</w:t>
       </w:r>
       <w:r>
         <w:rPr>
           <w:b w:val="0"/>
           <w:i w:val="0"/>
         </w:rPr>
-        <w:t xml:space="preserve"> for credit-oversight copilots.</w:t>
+        <w:t>.</w:t>
       </w:r>
     </w:p>
     <w:p>
@@ -264,44 +268,37 @@
       <w:r>
         <w:rPr>
           <w:b w:val="0"/>
-        </w:rPr>
-        <w:t xml:space="preserve">Partnered with </w:t>
+          <w:i w:val="0"/>
+        </w:rPr>
+        <w:t xml:space="preserve">Partnered with BCA/CCA data pipeline teams and built </w:t>
       </w:r>
       <w:r>
         <w:rPr>
           <w:b/>
-        </w:rPr>
-        <w:t>BCA/CCA data pipeline teams</w:t>
+          <w:i w:val="0"/>
+        </w:rPr>
+        <w:t>JSON-configurable Apache Flink pipelines on-premises</w:t>
       </w:r>
       <w:r>
         <w:rPr>
           <w:b w:val="0"/>
-        </w:rPr>
-        <w:t xml:space="preserve"> and built JSON-configurable </w:t>
+          <w:i w:val="0"/>
+        </w:rPr>
+        <w:t xml:space="preserve"> for ingestion, transformation, joins, validation, and downstream publishing, later migrating them to </w:t>
       </w:r>
       <w:r>
         <w:rPr>
           <w:b/>
-        </w:rPr>
-        <w:t>Apache Flink pipelines on GCP</w:t>
+          <w:i w:val="0"/>
+        </w:rPr>
+        <w:t>GCP</w:t>
       </w:r>
       <w:r>
         <w:rPr>
           <w:b w:val="0"/>
-        </w:rPr>
-        <w:t xml:space="preserve"> for ingestion, transformation, joins, validation, and downstream publishing, translating workflow knowledge into </w:t>
-      </w:r>
-      <w:r>
-        <w:rPr>
-          <w:b/>
-        </w:rPr>
-        <w:t>AI-ready pipeline patterns</w:t>
-      </w:r>
-      <w:r>
-        <w:rPr>
-          <w:b w:val="0"/>
-        </w:rPr>
-        <w:t xml:space="preserve"> for credit oversight use cases.</w:t>
+          <w:i w:val="0"/>
+        </w:rPr>
+        <w:t xml:space="preserve"> for digital-banking and credit-oversight use cases.</w:t>
       </w:r>
     </w:p>
     <w:p>
@@ -325,35 +322,49 @@
           <w:b/>
           <w:i w:val="0"/>
         </w:rPr>
-        <w:t>Airflow workflow automation and API-facing publishing</w:t>
+        <w:t>Airflow workflow automation</w:t>
       </w:r>
       <w:r>
         <w:rPr>
           <w:b w:val="0"/>
           <w:i w:val="0"/>
         </w:rPr>
-        <w:t xml:space="preserve"> with dependency controls, rerun handling, </w:t>
+        <w:t xml:space="preserve"> with dependency controls, rerun handling, SLA monitoring, data-quality checks, and failure alerting; published governed outputs to </w:t>
       </w:r>
       <w:r>
         <w:rPr>
           <w:b/>
           <w:i w:val="0"/>
         </w:rPr>
-        <w:t>SLA monitoring</w:t>
+        <w:t>BigQuery</w:t>
       </w:r>
       <w:r>
         <w:rPr>
           <w:b w:val="0"/>
           <w:i w:val="0"/>
         </w:rPr>
-        <w:t xml:space="preserve">, data-quality checks, and failure alerting, creating reliable signals for downstream </w:t>
+        <w:t xml:space="preserve"> and exposed controlled analytical paths through </w:t>
       </w:r>
       <w:r>
         <w:rPr>
           <w:b/>
           <w:i w:val="0"/>
         </w:rPr>
-        <w:t>AI platform and copilot services</w:t>
+        <w:t>AWS API Gateway, Lambda, and ECS</w:t>
+      </w:r>
+      <w:r>
+        <w:rPr>
+          <w:b w:val="0"/>
+          <w:i w:val="0"/>
+        </w:rPr>
+        <w:t xml:space="preserve"> for reporting applications and digital-banking products, with </w:t>
+      </w:r>
+      <w:r>
+        <w:rPr>
+          <w:b/>
+          <w:i w:val="0"/>
+        </w:rPr>
+        <w:t>stable data contracts, retries, and access controls</w:t>
       </w:r>
       <w:r>
         <w:rPr>
@@ -434,266 +445,79 @@
       <w:r>
         <w:rPr>
           <w:b w:val="0"/>
-        </w:rPr>
-        <w:t xml:space="preserve">Developed a </w:t>
+          <w:i w:val="0"/>
+        </w:rPr>
+        <w:t xml:space="preserve">Developed a reusable </w:t>
       </w:r>
       <w:r>
         <w:rPr>
           <w:b/>
-        </w:rPr>
-        <w:t>reusable agent platform harness</w:t>
-      </w:r>
-      <w:r>
-        <w:rPr>
-          <w:b w:val="0"/>
-        </w:rPr>
-        <w:t xml:space="preserve"> combining IRIS semantic search, scoped retrieval, prompt assembly, </w:t>
-      </w:r>
-      <w:r>
-        <w:rPr>
-          <w:b/>
-        </w:rPr>
-        <w:t>source-ledger tracking</w:t>
-      </w:r>
-      <w:r>
-        <w:rPr>
-          <w:b w:val="0"/>
-        </w:rPr>
-        <w:t xml:space="preserve">, and </w:t>
-      </w:r>
-      <w:r>
-        <w:rPr>
-          <w:b/>
-        </w:rPr>
-        <w:t>grounded response generation</w:t>
-      </w:r>
-      <w:r>
-        <w:rPr>
-          <w:b w:val="0"/>
-        </w:rPr>
-        <w:t xml:space="preserve"> for credit oversight users.</w:t>
-      </w:r>
-    </w:p>
-    <w:p>
-      <w:pPr>
-        <w:pStyle w:val="ResumeBullet"/>
-        <w:numPr>
-          <w:ilvl w:val="0"/>
-          <w:numId w:val="1"/>
-        </w:numPr>
-      </w:pPr>
-      <w:r>
-        <w:rPr>
-          <w:b w:val="0"/>
-        </w:rPr>
-        <w:t xml:space="preserve">Partnered with </w:t>
-      </w:r>
-      <w:r>
-        <w:rPr>
-          <w:b/>
-        </w:rPr>
-        <w:t>cross-functional product, data, and AI teams</w:t>
-      </w:r>
-      <w:r>
-        <w:rPr>
-          <w:b w:val="0"/>
-        </w:rPr>
-        <w:t xml:space="preserve"> to engineer an </w:t>
-      </w:r>
-      <w:r>
-        <w:rPr>
-          <w:b/>
-        </w:rPr>
-        <w:t>agent context harness</w:t>
-      </w:r>
-      <w:r>
-        <w:rPr>
-          <w:b w:val="0"/>
-        </w:rPr>
-        <w:t xml:space="preserve"> managing </w:t>
-      </w:r>
-      <w:r>
-        <w:rPr>
-          <w:b/>
-        </w:rPr>
-        <w:t>session state</w:t>
-      </w:r>
-      <w:r>
-        <w:rPr>
-          <w:b w:val="0"/>
-        </w:rPr>
-        <w:t xml:space="preserve">, selected documents, retrieved evidence, policy context, user intent, and </w:t>
-      </w:r>
-      <w:r>
-        <w:rPr>
-          <w:b/>
-        </w:rPr>
-        <w:t>controlled LLM input assembly</w:t>
-      </w:r>
-      <w:r>
-        <w:rPr>
-          <w:b w:val="0"/>
-        </w:rPr>
-        <w:t>.</w:t>
-      </w:r>
-    </w:p>
-    <w:p>
-      <w:pPr>
-        <w:pStyle w:val="ResumeBullet"/>
-        <w:numPr>
-          <w:ilvl w:val="0"/>
-          <w:numId w:val="1"/>
-        </w:numPr>
-      </w:pPr>
+          <w:i w:val="0"/>
+        </w:rPr>
+        <w:t>MCP runtime harness</w:t>
+      </w:r>
       <w:r>
         <w:rPr>
           <w:b w:val="0"/>
           <w:i w:val="0"/>
         </w:rPr>
-        <w:t xml:space="preserve">Strengthened </w:t>
+        <w:t xml:space="preserve"> combining </w:t>
       </w:r>
       <w:r>
         <w:rPr>
           <w:b/>
           <w:i w:val="0"/>
         </w:rPr>
-        <w:t>operational excellence, observability, and governance</w:t>
+        <w:t>IRIS semantic search</w:t>
       </w:r>
       <w:r>
         <w:rPr>
           <w:b w:val="0"/>
           <w:i w:val="0"/>
         </w:rPr>
-        <w:t xml:space="preserve"> across the </w:t>
+        <w:t xml:space="preserve">, </w:t>
       </w:r>
       <w:r>
         <w:rPr>
           <w:b/>
           <w:i w:val="0"/>
         </w:rPr>
-        <w:t>agent runtime</w:t>
+        <w:t>scoped retrieval</w:t>
       </w:r>
       <w:r>
         <w:rPr>
           <w:b w:val="0"/>
           <w:i w:val="0"/>
         </w:rPr>
-        <w:t xml:space="preserve"> through retrieval logs, execution traces, citation mapping, </w:t>
+        <w:t xml:space="preserve">, </w:t>
       </w:r>
       <w:r>
         <w:rPr>
           <w:b/>
           <w:i w:val="0"/>
         </w:rPr>
-        <w:t>guardrails</w:t>
+        <w:t>tool execution</w:t>
       </w:r>
       <w:r>
         <w:rPr>
           <w:b w:val="0"/>
           <w:i w:val="0"/>
         </w:rPr>
-        <w:t xml:space="preserve">, cache behavior, and </w:t>
+        <w:t xml:space="preserve">, prompt assembly, source-ledger tracking, and </w:t>
       </w:r>
       <w:r>
         <w:rPr>
           <w:b/>
           <w:i w:val="0"/>
         </w:rPr>
-        <w:t>audit-friendly response tracking</w:t>
+        <w:t>grounded response generation</w:t>
       </w:r>
       <w:r>
         <w:rPr>
           <w:b w:val="0"/>
           <w:i w:val="0"/>
         </w:rPr>
-        <w:t>.</w:t>
-      </w:r>
-    </w:p>
-    <w:p>
-      <w:pPr>
-        <w:pStyle w:val="RoleLine"/>
-        <w:keepNext/>
-        <w:tabs>
-          <w:tab w:val="right" w:pos="10080"/>
-        </w:tabs>
-      </w:pPr>
-      <w:r>
-        <w:rPr>
-          <w:b/>
-        </w:rPr>
-        <w:t>Skechers</w:t>
-      </w:r>
-      <w:r>
-        <w:t xml:space="preserve"> | Software Engineer</w:t>
-      </w:r>
-      <w:r>
-        <w:tab/>
-      </w:r>
-      <w:r>
-        <w:rPr>
-          <w:b/>
-        </w:rPr>
-        <w:t>Oct 2020 - Mar 2023</w:t>
-      </w:r>
-    </w:p>
-    <w:p>
-      <w:pPr>
-        <w:pStyle w:val="ImpactLine"/>
-        <w:keepNext/>
-      </w:pPr>
-      <w:r>
-        <w:rPr>
-          <w:b/>
-        </w:rPr>
-        <w:t>Impact:</w:t>
-      </w:r>
-      <w:r>
-        <w:t xml:space="preserve"> Delivered </w:t>
-      </w:r>
-      <w:r>
-        <w:rPr>
-          <w:b/>
-        </w:rPr>
-        <w:t>15+ Python APIs</w:t>
-      </w:r>
-      <w:r>
-        <w:t xml:space="preserve"> and event-driven services, maintained </w:t>
-      </w:r>
-      <w:r>
-        <w:rPr>
-          <w:b/>
-        </w:rPr>
-        <w:t>99.9% uptime</w:t>
-      </w:r>
-      <w:r>
-        <w:t xml:space="preserve">, reduced costs by </w:t>
-      </w:r>
-      <w:r>
-        <w:rPr>
-          <w:b/>
-        </w:rPr>
-        <w:t>22%</w:t>
-      </w:r>
-      <w:r>
-        <w:t xml:space="preserve">, migrated </w:t>
-      </w:r>
-      <w:r>
-        <w:rPr>
-          <w:b/>
-        </w:rPr>
-        <w:t>35M+ records</w:t>
-      </w:r>
-      <w:r>
-        <w:t xml:space="preserve">, and cut incident resolution time by </w:t>
-      </w:r>
-      <w:r>
-        <w:rPr>
-          <w:b/>
-        </w:rPr>
-        <w:t>40%</w:t>
-      </w:r>
-      <w:r>
-        <w:t>.</w:t>
+        <w:t xml:space="preserve"> for credit-oversight users.</w:t>
       </w:r>
     </w:p>
     <w:p>
@@ -706,40 +530,209 @@
         </w:numPr>
       </w:pPr>
       <w:r>
-        <w:t xml:space="preserve">Developed </w:t>
+        <w:rPr>
+          <w:b w:val="0"/>
+          <w:i w:val="0"/>
+        </w:rPr>
+        <w:t xml:space="preserve">Partnered with </w:t>
       </w:r>
       <w:r>
         <w:rPr>
           <w:b/>
-        </w:rPr>
-        <w:t>15+ Python/Pydantic REST APIs</w:t>
-      </w:r>
-      <w:r>
-        <w:t xml:space="preserve"> on microservices-style, event-driven </w:t>
+          <w:i w:val="0"/>
+        </w:rPr>
+        <w:t>cross-functional product, data, and AI teams</w:t>
+      </w:r>
+      <w:r>
+        <w:rPr>
+          <w:b w:val="0"/>
+          <w:i w:val="0"/>
+        </w:rPr>
+        <w:t xml:space="preserve"> to engineer an </w:t>
       </w:r>
       <w:r>
         <w:rPr>
           <w:b/>
-        </w:rPr>
-        <w:t>AWS Lambda/Step Functions</w:t>
-      </w:r>
-      <w:r>
-        <w:t xml:space="preserve">, sustaining </w:t>
+          <w:i w:val="0"/>
+        </w:rPr>
+        <w:t>agent context harness</w:t>
+      </w:r>
+      <w:r>
+        <w:rPr>
+          <w:b w:val="0"/>
+          <w:i w:val="0"/>
+        </w:rPr>
+        <w:t xml:space="preserve"> managing session state, selected documents, retrieved evidence, policy context, user intent, and </w:t>
       </w:r>
       <w:r>
         <w:rPr>
           <w:b/>
+          <w:i w:val="0"/>
+        </w:rPr>
+        <w:t>controlled LLM input assembly</w:t>
+      </w:r>
+      <w:r>
+        <w:rPr>
+          <w:b w:val="0"/>
+          <w:i w:val="0"/>
+        </w:rPr>
+        <w:t>.</w:t>
+      </w:r>
+    </w:p>
+    <w:p>
+      <w:pPr>
+        <w:pStyle w:val="ResumeBullet"/>
+        <w:numPr>
+          <w:ilvl w:val="0"/>
+          <w:numId w:val="1"/>
+        </w:numPr>
+      </w:pPr>
+      <w:r>
+        <w:rPr>
+          <w:b w:val="0"/>
+          <w:i w:val="0"/>
+        </w:rPr>
+        <w:t xml:space="preserve">Strengthened </w:t>
+      </w:r>
+      <w:r>
+        <w:rPr>
+          <w:b/>
+          <w:i w:val="0"/>
+        </w:rPr>
+        <w:t>operational excellence, observability, and governance</w:t>
+      </w:r>
+      <w:r>
+        <w:rPr>
+          <w:b w:val="0"/>
+          <w:i w:val="0"/>
+        </w:rPr>
+        <w:t xml:space="preserve"> across the </w:t>
+      </w:r>
+      <w:r>
+        <w:rPr>
+          <w:b/>
+          <w:i w:val="0"/>
+        </w:rPr>
+        <w:t>agent runtime</w:t>
+      </w:r>
+      <w:r>
+        <w:rPr>
+          <w:b w:val="0"/>
+          <w:i w:val="0"/>
+        </w:rPr>
+        <w:t xml:space="preserve"> through retrieval logs, execution traces, citation mapping, </w:t>
+      </w:r>
+      <w:r>
+        <w:rPr>
+          <w:b/>
+          <w:i w:val="0"/>
+        </w:rPr>
+        <w:t>guardrails</w:t>
+      </w:r>
+      <w:r>
+        <w:rPr>
+          <w:b w:val="0"/>
+          <w:i w:val="0"/>
+        </w:rPr>
+        <w:t xml:space="preserve">, cache behavior, and </w:t>
+      </w:r>
+      <w:r>
+        <w:rPr>
+          <w:b/>
+          <w:i w:val="0"/>
+        </w:rPr>
+        <w:t>audit-friendly response tracking</w:t>
+      </w:r>
+      <w:r>
+        <w:rPr>
+          <w:b w:val="0"/>
+          <w:i w:val="0"/>
+        </w:rPr>
+        <w:t>.</w:t>
+      </w:r>
+    </w:p>
+    <w:p>
+      <w:pPr>
+        <w:pStyle w:val="RoleLine"/>
+        <w:keepNext/>
+        <w:tabs>
+          <w:tab w:val="right" w:pos="10080"/>
+        </w:tabs>
+      </w:pPr>
+      <w:r>
+        <w:rPr>
+          <w:b/>
+        </w:rPr>
+        <w:t>Skechers</w:t>
+      </w:r>
+      <w:r>
+        <w:t xml:space="preserve"> | Software Engineer</w:t>
+      </w:r>
+      <w:r>
+        <w:tab/>
+      </w:r>
+      <w:r>
+        <w:rPr>
+          <w:b/>
+        </w:rPr>
+        <w:t>Oct 2020 - Mar 2023</w:t>
+      </w:r>
+    </w:p>
+    <w:p>
+      <w:pPr>
+        <w:pStyle w:val="ImpactLine"/>
+        <w:keepNext/>
+      </w:pPr>
+      <w:r>
+        <w:rPr>
+          <w:b/>
+        </w:rPr>
+        <w:t>Impact:</w:t>
+      </w:r>
+      <w:r>
+        <w:t xml:space="preserve"> Delivered </w:t>
+      </w:r>
+      <w:r>
+        <w:rPr>
+          <w:b/>
+        </w:rPr>
+        <w:t>15+ Python APIs</w:t>
+      </w:r>
+      <w:r>
+        <w:t xml:space="preserve"> and event-driven services, maintained </w:t>
+      </w:r>
+      <w:r>
+        <w:rPr>
+          <w:b/>
         </w:rPr>
         <w:t>99.9% uptime</w:t>
       </w:r>
       <w:r>
-        <w:t xml:space="preserve"> and cutting costs </w:t>
+        <w:t xml:space="preserve">, reduced costs by </w:t>
       </w:r>
       <w:r>
         <w:rPr>
           <w:b/>
         </w:rPr>
         <w:t>22%</w:t>
+      </w:r>
+      <w:r>
+        <w:t xml:space="preserve">, migrated </w:t>
+      </w:r>
+      <w:r>
+        <w:rPr>
+          <w:b/>
+        </w:rPr>
+        <w:t>35M+ records</w:t>
+      </w:r>
+      <w:r>
+        <w:t xml:space="preserve">, and cut incident resolution time by </w:t>
+      </w:r>
+      <w:r>
+        <w:rPr>
+          <w:b/>
+        </w:rPr>
+        <w:t>40%</w:t>
       </w:r>
       <w:r>
         <w:t>.</w:t>
@@ -755,34 +748,43 @@
         </w:numPr>
       </w:pPr>
       <w:r>
-        <w:t xml:space="preserve">Migrated </w:t>
+        <w:t xml:space="preserve">Developed </w:t>
       </w:r>
       <w:r>
         <w:rPr>
           <w:b/>
         </w:rPr>
-        <w:t>35M+ SFMC records</w:t>
-      </w:r>
-      <w:r>
-        <w:t xml:space="preserve"> into </w:t>
+        <w:t>15+ Python/Pydantic REST APIs</w:t>
+      </w:r>
+      <w:r>
+        <w:t xml:space="preserve"> on microservices-style, event-driven </w:t>
       </w:r>
       <w:r>
         <w:rPr>
           <w:b/>
         </w:rPr>
-        <w:t>MongoDB</w:t>
-      </w:r>
-      <w:r>
-        <w:t xml:space="preserve"> and improved query performance by </w:t>
+        <w:t>AWS Lambda/Step Functions</w:t>
+      </w:r>
+      <w:r>
+        <w:t xml:space="preserve">, sustaining </w:t>
       </w:r>
       <w:r>
         <w:rPr>
           <w:b/>
         </w:rPr>
-        <w:t>50%</w:t>
-      </w:r>
-      <w:r>
-        <w:t xml:space="preserve"> through indexing, caching, and data-access optimization.</w:t>
+        <w:t>99.9% uptime</w:t>
+      </w:r>
+      <w:r>
+        <w:t xml:space="preserve"> and cutting costs </w:t>
+      </w:r>
+      <w:r>
+        <w:rPr>
+          <w:b/>
+        </w:rPr>
+        <w:t>22%</w:t>
+      </w:r>
+      <w:r>
+        <w:t>.</w:t>
       </w:r>
     </w:p>
     <w:p>
@@ -795,34 +797,34 @@
         </w:numPr>
       </w:pPr>
       <w:r>
-        <w:t xml:space="preserve">Integrated </w:t>
+        <w:t xml:space="preserve">Migrated </w:t>
       </w:r>
       <w:r>
         <w:rPr>
           <w:b/>
         </w:rPr>
-        <w:t>SessionM</w:t>
-      </w:r>
-      <w:r>
-        <w:t xml:space="preserve">, SFMC, MongoDB, and </w:t>
+        <w:t>35M+ SFMC records</w:t>
+      </w:r>
+      <w:r>
+        <w:t xml:space="preserve"> into </w:t>
       </w:r>
       <w:r>
         <w:rPr>
           <w:b/>
         </w:rPr>
-        <w:t>AWS serverless services</w:t>
-      </w:r>
-      <w:r>
-        <w:t xml:space="preserve"> for loyalty/marketing workflows and </w:t>
+        <w:t>MongoDB</w:t>
+      </w:r>
+      <w:r>
+        <w:t xml:space="preserve"> and improved query performance by </w:t>
       </w:r>
       <w:r>
         <w:rPr>
           <w:b/>
         </w:rPr>
-        <w:t>sub-500ms transactions</w:t>
-      </w:r>
-      <w:r>
-        <w:t>.</w:t>
+        <w:t>50%</w:t>
+      </w:r>
+      <w:r>
+        <w:t xml:space="preserve"> through indexing, caching, and data-access optimization.</w:t>
       </w:r>
     </w:p>
     <w:p>
@@ -835,91 +837,34 @@
         </w:numPr>
       </w:pPr>
       <w:r>
-        <w:t xml:space="preserve">Applied </w:t>
+        <w:t xml:space="preserve">Integrated </w:t>
       </w:r>
       <w:r>
         <w:rPr>
           <w:b/>
         </w:rPr>
-        <w:t>event-driven API architecture</w:t>
-      </w:r>
-      <w:r>
-        <w:t xml:space="preserve"> across Lambda, </w:t>
+        <w:t>SessionM</w:t>
+      </w:r>
+      <w:r>
+        <w:t xml:space="preserve">, SFMC, MongoDB, and </w:t>
       </w:r>
       <w:r>
         <w:rPr>
           <w:b/>
         </w:rPr>
-        <w:t>Step Functions</w:t>
-      </w:r>
-      <w:r>
-        <w:t>, validation, orchestration, and data-access layers.</w:t>
-      </w:r>
-    </w:p>
-    <w:p>
-      <w:pPr>
-        <w:pStyle w:val="ResumeBullet"/>
-        <w:numPr>
-          <w:ilvl w:val="0"/>
-          <w:numId w:val="1"/>
-        </w:numPr>
-      </w:pPr>
-      <w:r>
-        <w:t xml:space="preserve">Improved </w:t>
+        <w:t>AWS serverless services</w:t>
+      </w:r>
+      <w:r>
+        <w:t xml:space="preserve"> for loyalty/marketing workflows and </w:t>
       </w:r>
       <w:r>
         <w:rPr>
           <w:b/>
         </w:rPr>
-        <w:t>production resilience</w:t>
-      </w:r>
-      <w:r>
-        <w:t xml:space="preserve"> with CloudWatch/Datadog alerts, </w:t>
-      </w:r>
-      <w:r>
-        <w:rPr>
-          <w:b/>
-        </w:rPr>
-        <w:t>API failure tracing</w:t>
-      </w:r>
-      <w:r>
-        <w:t xml:space="preserve">, </w:t>
-      </w:r>
-      <w:r>
-        <w:rPr>
-          <w:b/>
-        </w:rPr>
-        <w:t>retry handling</w:t>
-      </w:r>
-      <w:r>
-        <w:t>, and SLA-focused incident feedback.</w:t>
-      </w:r>
-    </w:p>
-    <w:p>
-      <w:pPr>
-        <w:pStyle w:val="RoleLine"/>
-        <w:keepNext/>
-        <w:tabs>
-          <w:tab w:val="right" w:pos="10080"/>
-        </w:tabs>
-      </w:pPr>
-      <w:r>
-        <w:rPr>
-          <w:b/>
-        </w:rPr>
-        <w:t>SOCH Inc.</w:t>
-      </w:r>
-      <w:r>
-        <w:t xml:space="preserve"> | Full-Stack Developer - Richmond, VA</w:t>
-      </w:r>
-      <w:r>
-        <w:tab/>
-      </w:r>
-      <w:r>
-        <w:rPr>
-          <w:b/>
-        </w:rPr>
-        <w:t>Jan 2020 - Sep 2020</w:t>
+        <w:t>sub-500ms transactions</w:t>
+      </w:r>
+      <w:r>
+        <w:t>.</w:t>
       </w:r>
     </w:p>
     <w:p>
@@ -932,25 +877,91 @@
         </w:numPr>
       </w:pPr>
       <w:r>
-        <w:t xml:space="preserve">Built a </w:t>
+        <w:t xml:space="preserve">Applied </w:t>
       </w:r>
       <w:r>
         <w:rPr>
           <w:b/>
         </w:rPr>
-        <w:t>Spring Boot</w:t>
-      </w:r>
-      <w:r>
-        <w:t xml:space="preserve"> ticketing system with </w:t>
+        <w:t>event-driven API architecture</w:t>
+      </w:r>
+      <w:r>
+        <w:t xml:space="preserve"> across Lambda, </w:t>
       </w:r>
       <w:r>
         <w:rPr>
           <w:b/>
         </w:rPr>
-        <w:t>REST microservices</w:t>
-      </w:r>
-      <w:r>
-        <w:t xml:space="preserve"> and full-stack workflow screens for government clients.</w:t>
+        <w:t>Step Functions</w:t>
+      </w:r>
+      <w:r>
+        <w:t>, validation, orchestration, and data-access layers.</w:t>
+      </w:r>
+    </w:p>
+    <w:p>
+      <w:pPr>
+        <w:pStyle w:val="ResumeBullet"/>
+        <w:numPr>
+          <w:ilvl w:val="0"/>
+          <w:numId w:val="1"/>
+        </w:numPr>
+      </w:pPr>
+      <w:r>
+        <w:t xml:space="preserve">Improved </w:t>
+      </w:r>
+      <w:r>
+        <w:rPr>
+          <w:b/>
+        </w:rPr>
+        <w:t>production resilience</w:t>
+      </w:r>
+      <w:r>
+        <w:t xml:space="preserve"> with CloudWatch/Datadog alerts, </w:t>
+      </w:r>
+      <w:r>
+        <w:rPr>
+          <w:b/>
+        </w:rPr>
+        <w:t>API failure tracing</w:t>
+      </w:r>
+      <w:r>
+        <w:t xml:space="preserve">, </w:t>
+      </w:r>
+      <w:r>
+        <w:rPr>
+          <w:b/>
+        </w:rPr>
+        <w:t>retry handling</w:t>
+      </w:r>
+      <w:r>
+        <w:t>, and SLA-focused incident feedback.</w:t>
+      </w:r>
+    </w:p>
+    <w:p>
+      <w:pPr>
+        <w:pStyle w:val="RoleLine"/>
+        <w:keepNext/>
+        <w:tabs>
+          <w:tab w:val="right" w:pos="10080"/>
+        </w:tabs>
+      </w:pPr>
+      <w:r>
+        <w:rPr>
+          <w:b/>
+        </w:rPr>
+        <w:t>SOCH Inc.</w:t>
+      </w:r>
+      <w:r>
+        <w:t xml:space="preserve"> | Full-Stack Developer - Richmond, VA</w:t>
+      </w:r>
+      <w:r>
+        <w:tab/>
+      </w:r>
+      <w:r>
+        <w:rPr>
+          <w:b/>
+        </w:rPr>
+        <w:t>Jan 2020 - Sep 2020</w:t>
       </w:r>
     </w:p>
     <w:p>
@@ -963,16 +974,25 @@
         </w:numPr>
       </w:pPr>
       <w:r>
-        <w:t xml:space="preserve">Used </w:t>
+        <w:t xml:space="preserve">Built a </w:t>
       </w:r>
       <w:r>
         <w:rPr>
           <w:b/>
         </w:rPr>
-        <w:t>Java ExecutorService/CompletableFuture</w:t>
-      </w:r>
-      <w:r>
-        <w:t xml:space="preserve"> for async ticket updates, notifications, and background job handling.</w:t>
+        <w:t>Spring Boot</w:t>
+      </w:r>
+      <w:r>
+        <w:t xml:space="preserve"> ticketing system with </w:t>
+      </w:r>
+      <w:r>
+        <w:rPr>
+          <w:b/>
+        </w:rPr>
+        <w:t>REST microservices</w:t>
+      </w:r>
+      <w:r>
+        <w:t xml:space="preserve"> and full-stack workflow screens for government clients.</w:t>
       </w:r>
     </w:p>
     <w:p>
@@ -985,6 +1005,28 @@
         </w:numPr>
       </w:pPr>
       <w:r>
+        <w:t xml:space="preserve">Used </w:t>
+      </w:r>
+      <w:r>
+        <w:rPr>
+          <w:b/>
+        </w:rPr>
+        <w:t>Java ExecutorService/CompletableFuture</w:t>
+      </w:r>
+      <w:r>
+        <w:t xml:space="preserve"> for async ticket updates, notifications, and background job handling.</w:t>
+      </w:r>
+    </w:p>
+    <w:p>
+      <w:pPr>
+        <w:pStyle w:val="ResumeBullet"/>
+        <w:keepLines/>
+        <w:numPr>
+          <w:ilvl w:val="0"/>
+          <w:numId w:val="1"/>
+        </w:numPr>
+      </w:pPr>
+      <w:r>
         <w:t xml:space="preserve">Managed </w:t>
       </w:r>
       <w:r>
@@ -1034,7 +1076,14 @@
           <w:b/>
           <w:i w:val="0"/>
         </w:rPr>
-        <w:t>OmInsights - Founder-Led Applied AI Platform Build</w:t>
+        <w:t>OmInsights</w:t>
+      </w:r>
+      <w:r>
+        <w:rPr>
+          <w:b w:val="0"/>
+          <w:i w:val="0"/>
+        </w:rPr>
+        <w:t xml:space="preserve"> - Founder-Led Applied AI Platform Build</w:t>
       </w:r>
       <w:r>
         <w:rPr>

</xml_diff>